<commit_message>
Actualización de documentación del proyecto
</commit_message>
<xml_diff>
--- a/Documentacion/FD06-EPIS-PropuestaProyecto.docx
+++ b/Documentacion/FD06-EPIS-PropuestaProyecto.docx
@@ -2606,6 +2606,7 @@
             <w:rPr>
               <w:sz w:val="24"/>
             </w:rPr>
+            <w:lastRenderedPageBreak/>
             <w:t xml:space="preserve">Anexo 01 – Requerimientos del Sistema </w:t>
           </w:r>
           <w:r>
@@ -3619,6 +3620,7 @@
           <w:sz w:val="24"/>
           <w:szCs w:val="24"/>
         </w:rPr>
+        <w:lastRenderedPageBreak/>
         <w:t xml:space="preserve">Publicación y visualización de contenido en el </w:t>
       </w:r>
       <w:proofErr w:type="spellStart"/>
@@ -3654,7 +3656,6 @@
           <w:sz w:val="24"/>
           <w:szCs w:val="24"/>
         </w:rPr>
-        <w:lastRenderedPageBreak/>
         <w:t xml:space="preserve">Creación de historias efímeras </w:t>
       </w:r>
     </w:p>
@@ -4076,7 +4077,16 @@
           <w:szCs w:val="24"/>
         </w:rPr>
         <w:br/>
-        <w:t xml:space="preserve">Explica el enfoque metodológico utilizado para el desarrollo del proyecto. Se basa en prácticas ágiles, con una división del trabajo por microservicios (autenticación, publicaciones e historias, perfiles e interacciones). Incluye el uso de herramientas como GitHub para control de versiones, GitHub </w:t>
+        <w:t xml:space="preserve">Explica el enfoque metodológico utilizado para el desarrollo del proyecto. Se basa en prácticas ágiles, con una división del trabajo por microservicios (autenticación, publicaciones e historias, perfiles e interacciones). Incluye el uso de herramientas </w:t>
+      </w:r>
+      <w:r>
+        <w:rPr>
+          <w:bCs/>
+          <w:sz w:val="24"/>
+          <w:szCs w:val="24"/>
+        </w:rPr>
+        <w:lastRenderedPageBreak/>
+        <w:t xml:space="preserve">como GitHub para control de versiones, GitHub </w:t>
       </w:r>
       <w:proofErr w:type="spellStart"/>
       <w:r>
@@ -4094,7 +4104,7 @@
           <w:sz w:val="24"/>
           <w:szCs w:val="24"/>
         </w:rPr>
-        <w:t xml:space="preserve"> para integración continua, Docker para </w:t>
+        <w:t xml:space="preserve"> para integración continua, Docker para contenerización, y </w:t>
       </w:r>
       <w:proofErr w:type="spellStart"/>
       <w:r>
@@ -4103,7 +4113,7 @@
           <w:sz w:val="24"/>
           <w:szCs w:val="24"/>
         </w:rPr>
-        <w:t>contenerización</w:t>
+        <w:t>Terraform</w:t>
       </w:r>
       <w:proofErr w:type="spellEnd"/>
       <w:r>
@@ -4112,34 +4122,7 @@
           <w:sz w:val="24"/>
           <w:szCs w:val="24"/>
         </w:rPr>
-        <w:t xml:space="preserve">, y </w:t>
-      </w:r>
-      <w:proofErr w:type="spellStart"/>
-      <w:r>
-        <w:rPr>
-          <w:bCs/>
-          <w:sz w:val="24"/>
-          <w:szCs w:val="24"/>
-        </w:rPr>
-        <w:t>Terraform</w:t>
-      </w:r>
-      <w:proofErr w:type="spellEnd"/>
-      <w:r>
-        <w:rPr>
-          <w:bCs/>
-          <w:sz w:val="24"/>
-          <w:szCs w:val="24"/>
-        </w:rPr>
-        <w:t xml:space="preserve"> para la gestión de infraestructura como </w:t>
-      </w:r>
-      <w:r>
-        <w:rPr>
-          <w:bCs/>
-          <w:sz w:val="24"/>
-          <w:szCs w:val="24"/>
-        </w:rPr>
-        <w:lastRenderedPageBreak/>
-        <w:t xml:space="preserve">código. El desarrollo se realiza de manera incremental, priorizando funcionalidades críticas como la autenticación y el </w:t>
+        <w:t xml:space="preserve"> para la gestión de infraestructura como código. El desarrollo se realiza de manera incremental, priorizando funcionalidades críticas como la autenticación y el </w:t>
       </w:r>
       <w:proofErr w:type="spellStart"/>
       <w:r>
@@ -4595,6 +4578,7 @@
           <w:sz w:val="24"/>
           <w:szCs w:val="24"/>
         </w:rPr>
+        <w:lastRenderedPageBreak/>
         <w:t xml:space="preserve">Configuración del entorno con Docker y Docker </w:t>
       </w:r>
       <w:proofErr w:type="spellStart"/>
@@ -4712,7 +4696,6 @@
           <w:sz w:val="24"/>
           <w:szCs w:val="24"/>
         </w:rPr>
-        <w:lastRenderedPageBreak/>
         <w:t xml:space="preserve">Documentación técnica en README y Wiki del repositorio </w:t>
       </w:r>
     </w:p>
@@ -5244,6 +5227,7 @@
           <w:sz w:val="24"/>
           <w:szCs w:val="24"/>
         </w:rPr>
+        <w:lastRenderedPageBreak/>
         <w:t>14. Cronograma del Proyecto</w:t>
       </w:r>
       <w:r>
@@ -5330,7 +5314,6 @@
                 <w:b/>
                 <w:bCs/>
               </w:rPr>
-              <w:lastRenderedPageBreak/>
               <w:t>Mes</w:t>
             </w:r>
           </w:p>
@@ -5911,6 +5894,7 @@
           <w:sz w:val="24"/>
           <w:szCs w:val="24"/>
         </w:rPr>
+        <w:lastRenderedPageBreak/>
         <w:t>FD06 – Propuesta del Proyecto</w:t>
       </w:r>
       <w:r>
@@ -5979,7 +5963,6 @@
           <w:sz w:val="24"/>
           <w:szCs w:val="24"/>
         </w:rPr>
-        <w:lastRenderedPageBreak/>
         <w:t xml:space="preserve">Wiki documentada con </w:t>
       </w:r>
       <w:proofErr w:type="spellStart"/>
@@ -6245,7 +6228,15 @@
           <w:szCs w:val="24"/>
         </w:rPr>
         <w:br/>
-        <w:t>Corresponden a servicios básicos necesarios durante el desarrollo, como acceso a Internet y consumo de energía eléctrica durante un período de cuatro meses (marzo a junio).</w:t>
+        <w:t xml:space="preserve">Corresponden a servicios básicos necesarios durante el desarrollo, como acceso a </w:t>
+      </w:r>
+      <w:r>
+        <w:rPr>
+          <w:sz w:val="24"/>
+          <w:szCs w:val="24"/>
+        </w:rPr>
+        <w:lastRenderedPageBreak/>
+        <w:t>Internet y consumo de energía eléctrica durante un período de cuatro meses (marzo a junio).</w:t>
       </w:r>
     </w:p>
     <w:p>
@@ -6283,7 +6274,6 @@
           <w:sz w:val="24"/>
           <w:szCs w:val="24"/>
         </w:rPr>
-        <w:lastRenderedPageBreak/>
         <w:t>Costos de Personal:</w:t>
       </w:r>
       <w:r>
@@ -6472,52 +6462,19 @@
     <w:p>
       <w:pPr>
         <w:rPr>
-          <w:sz w:val="24"/>
-          <w:szCs w:val="24"/>
-        </w:rPr>
-      </w:pPr>
-    </w:p>
-    <w:p>
-      <w:pPr>
-        <w:rPr>
-          <w:sz w:val="24"/>
-          <w:szCs w:val="24"/>
-        </w:rPr>
-      </w:pPr>
-    </w:p>
-    <w:p>
-      <w:pPr>
-        <w:rPr>
-          <w:sz w:val="24"/>
-          <w:szCs w:val="24"/>
-        </w:rPr>
-      </w:pPr>
-    </w:p>
-    <w:p>
-      <w:pPr>
-        <w:rPr>
-          <w:sz w:val="24"/>
-          <w:szCs w:val="24"/>
-        </w:rPr>
-      </w:pPr>
-    </w:p>
-    <w:p>
-      <w:pPr>
-        <w:rPr>
-          <w:b/>
-          <w:bCs/>
-          <w:sz w:val="24"/>
-          <w:szCs w:val="24"/>
-        </w:rPr>
-      </w:pPr>
-      <w:r>
-        <w:rPr>
-          <w:b/>
-          <w:bCs/>
-          <w:sz w:val="24"/>
-          <w:szCs w:val="24"/>
-        </w:rPr>
-        <w:lastRenderedPageBreak/>
+          <w:b/>
+          <w:bCs/>
+          <w:sz w:val="24"/>
+          <w:szCs w:val="24"/>
+        </w:rPr>
+      </w:pPr>
+      <w:r>
+        <w:rPr>
+          <w:b/>
+          <w:bCs/>
+          <w:sz w:val="24"/>
+          <w:szCs w:val="24"/>
+        </w:rPr>
         <w:t>Anexo 01 – Requerimientos del Sistema Red Social UPT</w:t>
       </w:r>
     </w:p>
@@ -6735,18 +6692,2306 @@
         <w:t xml:space="preserve">Panel de administración </w:t>
       </w:r>
     </w:p>
-    <w:p>
-      <w:pPr>
-        <w:rPr>
-          <w:sz w:val="24"/>
-          <w:szCs w:val="24"/>
-        </w:rPr>
-      </w:pPr>
-      <w:r>
-        <w:rPr>
-          <w:sz w:val="24"/>
-          <w:szCs w:val="24"/>
-        </w:rPr>
+    <w:tbl>
+      <w:tblPr>
+        <w:tblW w:w="0" w:type="auto"/>
+        <w:tblCellSpacing w:w="15" w:type="dxa"/>
+        <w:tblBorders>
+          <w:top w:val="single" w:sz="4" w:space="0" w:color="auto"/>
+          <w:left w:val="single" w:sz="4" w:space="0" w:color="auto"/>
+          <w:bottom w:val="single" w:sz="4" w:space="0" w:color="auto"/>
+          <w:right w:val="single" w:sz="4" w:space="0" w:color="auto"/>
+          <w:insideH w:val="single" w:sz="4" w:space="0" w:color="auto"/>
+          <w:insideV w:val="single" w:sz="4" w:space="0" w:color="auto"/>
+        </w:tblBorders>
+        <w:tblCellMar>
+          <w:top w:w="15" w:type="dxa"/>
+          <w:left w:w="15" w:type="dxa"/>
+          <w:bottom w:w="15" w:type="dxa"/>
+          <w:right w:w="15" w:type="dxa"/>
+        </w:tblCellMar>
+        <w:tblLook w:val="04A0" w:firstRow="1" w:lastRow="0" w:firstColumn="1" w:lastColumn="0" w:noHBand="0" w:noVBand="1"/>
+      </w:tblPr>
+      <w:tblGrid>
+        <w:gridCol w:w="534"/>
+        <w:gridCol w:w="1679"/>
+        <w:gridCol w:w="1814"/>
+        <w:gridCol w:w="1044"/>
+        <w:gridCol w:w="1704"/>
+        <w:gridCol w:w="1719"/>
+      </w:tblGrid>
+      <w:tr>
+        <w:trPr>
+          <w:tblHeader/>
+          <w:tblCellSpacing w:w="15" w:type="dxa"/>
+        </w:trPr>
+        <w:tc>
+          <w:tcPr>
+            <w:tcW w:w="0" w:type="auto"/>
+            <w:vAlign w:val="center"/>
+            <w:hideMark/>
+          </w:tcPr>
+          <w:p>
+            <w:pPr>
+              <w:rPr>
+                <w:rFonts w:ascii="Arial" w:hAnsi="Arial" w:cs="Arial"/>
+                <w:b/>
+                <w:bCs/>
+              </w:rPr>
+            </w:pPr>
+            <w:r>
+              <w:rPr>
+                <w:rFonts w:ascii="Arial" w:hAnsi="Arial" w:cs="Arial"/>
+                <w:b/>
+                <w:bCs/>
+              </w:rPr>
+              <w:t>Nro.</w:t>
+            </w:r>
+          </w:p>
+        </w:tc>
+        <w:tc>
+          <w:tcPr>
+            <w:tcW w:w="0" w:type="auto"/>
+            <w:vAlign w:val="center"/>
+            <w:hideMark/>
+          </w:tcPr>
+          <w:p>
+            <w:pPr>
+              <w:rPr>
+                <w:rFonts w:ascii="Arial" w:hAnsi="Arial" w:cs="Arial"/>
+                <w:b/>
+                <w:bCs/>
+              </w:rPr>
+            </w:pPr>
+            <w:r>
+              <w:rPr>
+                <w:rFonts w:ascii="Arial" w:hAnsi="Arial" w:cs="Arial"/>
+                <w:b/>
+                <w:bCs/>
+              </w:rPr>
+              <w:t>Requerimiento Funcional</w:t>
+            </w:r>
+          </w:p>
+        </w:tc>
+        <w:tc>
+          <w:tcPr>
+            <w:tcW w:w="0" w:type="auto"/>
+            <w:vAlign w:val="center"/>
+            <w:hideMark/>
+          </w:tcPr>
+          <w:p>
+            <w:pPr>
+              <w:rPr>
+                <w:rFonts w:ascii="Arial" w:hAnsi="Arial" w:cs="Arial"/>
+                <w:b/>
+                <w:bCs/>
+              </w:rPr>
+            </w:pPr>
+            <w:r>
+              <w:rPr>
+                <w:rFonts w:ascii="Arial" w:hAnsi="Arial" w:cs="Arial"/>
+                <w:b/>
+                <w:bCs/>
+              </w:rPr>
+              <w:t>Descripción</w:t>
+            </w:r>
+          </w:p>
+        </w:tc>
+        <w:tc>
+          <w:tcPr>
+            <w:tcW w:w="0" w:type="auto"/>
+            <w:vAlign w:val="center"/>
+            <w:hideMark/>
+          </w:tcPr>
+          <w:p>
+            <w:pPr>
+              <w:rPr>
+                <w:rFonts w:ascii="Arial" w:hAnsi="Arial" w:cs="Arial"/>
+                <w:b/>
+                <w:bCs/>
+              </w:rPr>
+            </w:pPr>
+            <w:r>
+              <w:rPr>
+                <w:rFonts w:ascii="Arial" w:hAnsi="Arial" w:cs="Arial"/>
+                <w:b/>
+                <w:bCs/>
+              </w:rPr>
+              <w:t>Prioridad</w:t>
+            </w:r>
+          </w:p>
+        </w:tc>
+        <w:tc>
+          <w:tcPr>
+            <w:tcW w:w="0" w:type="auto"/>
+            <w:vAlign w:val="center"/>
+            <w:hideMark/>
+          </w:tcPr>
+          <w:p>
+            <w:pPr>
+              <w:rPr>
+                <w:rFonts w:ascii="Arial" w:hAnsi="Arial" w:cs="Arial"/>
+                <w:b/>
+                <w:bCs/>
+              </w:rPr>
+            </w:pPr>
+            <w:r>
+              <w:rPr>
+                <w:rFonts w:ascii="Arial" w:hAnsi="Arial" w:cs="Arial"/>
+                <w:b/>
+                <w:bCs/>
+              </w:rPr>
+              <w:t>Inquietudes</w:t>
+            </w:r>
+          </w:p>
+        </w:tc>
+        <w:tc>
+          <w:tcPr>
+            <w:tcW w:w="0" w:type="auto"/>
+            <w:vAlign w:val="center"/>
+            <w:hideMark/>
+          </w:tcPr>
+          <w:p>
+            <w:pPr>
+              <w:rPr>
+                <w:rFonts w:ascii="Arial" w:hAnsi="Arial" w:cs="Arial"/>
+                <w:b/>
+                <w:bCs/>
+              </w:rPr>
+            </w:pPr>
+            <w:r>
+              <w:rPr>
+                <w:rFonts w:ascii="Arial" w:hAnsi="Arial" w:cs="Arial"/>
+                <w:b/>
+                <w:bCs/>
+              </w:rPr>
+              <w:t>Solución Propuesta</w:t>
+            </w:r>
+          </w:p>
+        </w:tc>
+      </w:tr>
+      <w:tr>
+        <w:trPr>
+          <w:tblCellSpacing w:w="15" w:type="dxa"/>
+        </w:trPr>
+        <w:tc>
+          <w:tcPr>
+            <w:tcW w:w="0" w:type="auto"/>
+            <w:vAlign w:val="center"/>
+            <w:hideMark/>
+          </w:tcPr>
+          <w:p>
+            <w:pPr>
+              <w:rPr>
+                <w:rFonts w:ascii="Arial" w:hAnsi="Arial" w:cs="Arial"/>
+              </w:rPr>
+            </w:pPr>
+            <w:r>
+              <w:rPr>
+                <w:rFonts w:ascii="Arial" w:hAnsi="Arial" w:cs="Arial"/>
+                <w:b/>
+                <w:bCs/>
+              </w:rPr>
+              <w:t>RF-01</w:t>
+            </w:r>
+          </w:p>
+        </w:tc>
+        <w:tc>
+          <w:tcPr>
+            <w:tcW w:w="0" w:type="auto"/>
+            <w:vAlign w:val="center"/>
+            <w:hideMark/>
+          </w:tcPr>
+          <w:p>
+            <w:pPr>
+              <w:rPr>
+                <w:rFonts w:ascii="Arial" w:hAnsi="Arial" w:cs="Arial"/>
+              </w:rPr>
+            </w:pPr>
+            <w:r>
+              <w:rPr>
+                <w:rFonts w:ascii="Arial" w:hAnsi="Arial" w:cs="Arial"/>
+                <w:b/>
+                <w:bCs/>
+              </w:rPr>
+              <w:t>Autenticación Institucional con Google OAuth</w:t>
+            </w:r>
+          </w:p>
+        </w:tc>
+        <w:tc>
+          <w:tcPr>
+            <w:tcW w:w="0" w:type="auto"/>
+            <w:vAlign w:val="center"/>
+            <w:hideMark/>
+          </w:tcPr>
+          <w:p>
+            <w:pPr>
+              <w:rPr>
+                <w:rFonts w:ascii="Arial" w:hAnsi="Arial" w:cs="Arial"/>
+              </w:rPr>
+            </w:pPr>
+            <w:r>
+              <w:rPr>
+                <w:rFonts w:ascii="Arial" w:hAnsi="Arial" w:cs="Arial"/>
+              </w:rPr>
+              <w:t xml:space="preserve">Permitir el inicio de sesión únicamente mediante cuentas institucionales con dominio </w:t>
+            </w:r>
+            <w:r>
+              <w:rPr>
+                <w:rFonts w:ascii="Arial" w:hAnsi="Arial" w:cs="Arial"/>
+                <w:b/>
+                <w:bCs/>
+              </w:rPr>
+              <w:t>@virtual.upt.pe</w:t>
+            </w:r>
+            <w:r>
+              <w:rPr>
+                <w:rFonts w:ascii="Arial" w:hAnsi="Arial" w:cs="Arial"/>
+              </w:rPr>
+              <w:t xml:space="preserve"> utilizando Google OAuth 2.0. En el primer acceso, el usuario deberá completar su información académica antes de ingresar al sistema.</w:t>
+            </w:r>
+          </w:p>
+        </w:tc>
+        <w:tc>
+          <w:tcPr>
+            <w:tcW w:w="0" w:type="auto"/>
+            <w:vAlign w:val="center"/>
+            <w:hideMark/>
+          </w:tcPr>
+          <w:p>
+            <w:pPr>
+              <w:rPr>
+                <w:rFonts w:ascii="Arial" w:hAnsi="Arial" w:cs="Arial"/>
+              </w:rPr>
+            </w:pPr>
+            <w:r>
+              <w:rPr>
+                <w:rFonts w:ascii="Arial" w:hAnsi="Arial" w:cs="Arial"/>
+              </w:rPr>
+              <w:t>Alta</w:t>
+            </w:r>
+          </w:p>
+        </w:tc>
+        <w:tc>
+          <w:tcPr>
+            <w:tcW w:w="0" w:type="auto"/>
+            <w:vAlign w:val="center"/>
+            <w:hideMark/>
+          </w:tcPr>
+          <w:p>
+            <w:pPr>
+              <w:rPr>
+                <w:rFonts w:ascii="Arial" w:hAnsi="Arial" w:cs="Arial"/>
+              </w:rPr>
+            </w:pPr>
+            <w:r>
+              <w:rPr>
+                <w:rFonts w:ascii="Arial" w:hAnsi="Arial" w:cs="Arial"/>
+              </w:rPr>
+              <w:t>Garantizar que solo miembros de la UPT puedan acceder y que la información académica sea válida.</w:t>
+            </w:r>
+          </w:p>
+        </w:tc>
+        <w:tc>
+          <w:tcPr>
+            <w:tcW w:w="0" w:type="auto"/>
+            <w:vAlign w:val="center"/>
+            <w:hideMark/>
+          </w:tcPr>
+          <w:p>
+            <w:pPr>
+              <w:rPr>
+                <w:rFonts w:ascii="Arial" w:hAnsi="Arial" w:cs="Arial"/>
+              </w:rPr>
+            </w:pPr>
+            <w:r>
+              <w:rPr>
+                <w:rFonts w:ascii="Arial" w:hAnsi="Arial" w:cs="Arial"/>
+              </w:rPr>
+              <w:t xml:space="preserve">Implementar Google OAuth 2.0, validación del dominio institucional en el </w:t>
+            </w:r>
+            <w:proofErr w:type="spellStart"/>
+            <w:r>
+              <w:rPr>
+                <w:rFonts w:ascii="Arial" w:hAnsi="Arial" w:cs="Arial"/>
+              </w:rPr>
+              <w:t>backend</w:t>
+            </w:r>
+            <w:proofErr w:type="spellEnd"/>
+            <w:r>
+              <w:rPr>
+                <w:rFonts w:ascii="Arial" w:hAnsi="Arial" w:cs="Arial"/>
+              </w:rPr>
+              <w:t xml:space="preserve">, formulario de </w:t>
+            </w:r>
+            <w:proofErr w:type="spellStart"/>
+            <w:r>
+              <w:rPr>
+                <w:rFonts w:ascii="Arial" w:hAnsi="Arial" w:cs="Arial"/>
+              </w:rPr>
+              <w:t>onboarding</w:t>
+            </w:r>
+            <w:proofErr w:type="spellEnd"/>
+            <w:r>
+              <w:rPr>
+                <w:rFonts w:ascii="Arial" w:hAnsi="Arial" w:cs="Arial"/>
+              </w:rPr>
+              <w:t xml:space="preserve"> y autenticación mediante JWT.</w:t>
+            </w:r>
+          </w:p>
+        </w:tc>
+      </w:tr>
+      <w:tr>
+        <w:trPr>
+          <w:tblCellSpacing w:w="15" w:type="dxa"/>
+        </w:trPr>
+        <w:tc>
+          <w:tcPr>
+            <w:tcW w:w="0" w:type="auto"/>
+            <w:vAlign w:val="center"/>
+            <w:hideMark/>
+          </w:tcPr>
+          <w:p>
+            <w:pPr>
+              <w:rPr>
+                <w:rFonts w:ascii="Arial" w:hAnsi="Arial" w:cs="Arial"/>
+              </w:rPr>
+            </w:pPr>
+            <w:r>
+              <w:rPr>
+                <w:rFonts w:ascii="Arial" w:hAnsi="Arial" w:cs="Arial"/>
+                <w:b/>
+                <w:bCs/>
+              </w:rPr>
+              <w:t>RF-02</w:t>
+            </w:r>
+          </w:p>
+        </w:tc>
+        <w:tc>
+          <w:tcPr>
+            <w:tcW w:w="0" w:type="auto"/>
+            <w:vAlign w:val="center"/>
+            <w:hideMark/>
+          </w:tcPr>
+          <w:p>
+            <w:pPr>
+              <w:rPr>
+                <w:rFonts w:ascii="Arial" w:hAnsi="Arial" w:cs="Arial"/>
+              </w:rPr>
+            </w:pPr>
+            <w:r>
+              <w:rPr>
+                <w:rFonts w:ascii="Arial" w:hAnsi="Arial" w:cs="Arial"/>
+                <w:b/>
+                <w:bCs/>
+              </w:rPr>
+              <w:t>Creación de Publicaciones con Control de Visibilidad</w:t>
+            </w:r>
+          </w:p>
+        </w:tc>
+        <w:tc>
+          <w:tcPr>
+            <w:tcW w:w="0" w:type="auto"/>
+            <w:vAlign w:val="center"/>
+            <w:hideMark/>
+          </w:tcPr>
+          <w:p>
+            <w:pPr>
+              <w:rPr>
+                <w:rFonts w:ascii="Arial" w:hAnsi="Arial" w:cs="Arial"/>
+              </w:rPr>
+            </w:pPr>
+            <w:r>
+              <w:rPr>
+                <w:rFonts w:ascii="Arial" w:hAnsi="Arial" w:cs="Arial"/>
+              </w:rPr>
+              <w:t xml:space="preserve">Permitir crear publicaciones con texto e imágenes definiendo su visibilidad para </w:t>
+            </w:r>
+            <w:r>
+              <w:rPr>
+                <w:rFonts w:ascii="Arial" w:hAnsi="Arial" w:cs="Arial"/>
+              </w:rPr>
+              <w:lastRenderedPageBreak/>
+              <w:t>toda la comunidad, solo amigos o únicamente usuarios de la misma facultad.</w:t>
+            </w:r>
+          </w:p>
+        </w:tc>
+        <w:tc>
+          <w:tcPr>
+            <w:tcW w:w="0" w:type="auto"/>
+            <w:vAlign w:val="center"/>
+            <w:hideMark/>
+          </w:tcPr>
+          <w:p>
+            <w:pPr>
+              <w:rPr>
+                <w:rFonts w:ascii="Arial" w:hAnsi="Arial" w:cs="Arial"/>
+              </w:rPr>
+            </w:pPr>
+            <w:r>
+              <w:rPr>
+                <w:rFonts w:ascii="Arial" w:hAnsi="Arial" w:cs="Arial"/>
+              </w:rPr>
+              <w:lastRenderedPageBreak/>
+              <w:t>Alta</w:t>
+            </w:r>
+          </w:p>
+        </w:tc>
+        <w:tc>
+          <w:tcPr>
+            <w:tcW w:w="0" w:type="auto"/>
+            <w:vAlign w:val="center"/>
+            <w:hideMark/>
+          </w:tcPr>
+          <w:p>
+            <w:pPr>
+              <w:rPr>
+                <w:rFonts w:ascii="Arial" w:hAnsi="Arial" w:cs="Arial"/>
+              </w:rPr>
+            </w:pPr>
+            <w:r>
+              <w:rPr>
+                <w:rFonts w:ascii="Arial" w:hAnsi="Arial" w:cs="Arial"/>
+              </w:rPr>
+              <w:t xml:space="preserve">Controlar correctamente quién puede visualizar cada publicación y optimizar las </w:t>
+            </w:r>
+            <w:r>
+              <w:rPr>
+                <w:rFonts w:ascii="Arial" w:hAnsi="Arial" w:cs="Arial"/>
+              </w:rPr>
+              <w:lastRenderedPageBreak/>
+              <w:t xml:space="preserve">consultas del </w:t>
+            </w:r>
+            <w:proofErr w:type="spellStart"/>
+            <w:r>
+              <w:rPr>
+                <w:rFonts w:ascii="Arial" w:hAnsi="Arial" w:cs="Arial"/>
+              </w:rPr>
+              <w:t>feed</w:t>
+            </w:r>
+            <w:proofErr w:type="spellEnd"/>
+            <w:r>
+              <w:rPr>
+                <w:rFonts w:ascii="Arial" w:hAnsi="Arial" w:cs="Arial"/>
+              </w:rPr>
+              <w:t>.</w:t>
+            </w:r>
+          </w:p>
+        </w:tc>
+        <w:tc>
+          <w:tcPr>
+            <w:tcW w:w="0" w:type="auto"/>
+            <w:vAlign w:val="center"/>
+            <w:hideMark/>
+          </w:tcPr>
+          <w:p>
+            <w:pPr>
+              <w:rPr>
+                <w:rFonts w:ascii="Arial" w:hAnsi="Arial" w:cs="Arial"/>
+              </w:rPr>
+            </w:pPr>
+            <w:r>
+              <w:rPr>
+                <w:rFonts w:ascii="Arial" w:hAnsi="Arial" w:cs="Arial"/>
+              </w:rPr>
+              <w:lastRenderedPageBreak/>
+              <w:t xml:space="preserve">Implementar un microservicio de publicaciones que almacene el nivel de visibilidad y los </w:t>
+            </w:r>
+            <w:r>
+              <w:rPr>
+                <w:rFonts w:ascii="Arial" w:hAnsi="Arial" w:cs="Arial"/>
+              </w:rPr>
+              <w:lastRenderedPageBreak/>
+              <w:t>metadatos del autor.</w:t>
+            </w:r>
+          </w:p>
+        </w:tc>
+      </w:tr>
+      <w:tr>
+        <w:trPr>
+          <w:tblCellSpacing w:w="15" w:type="dxa"/>
+        </w:trPr>
+        <w:tc>
+          <w:tcPr>
+            <w:tcW w:w="0" w:type="auto"/>
+            <w:vAlign w:val="center"/>
+            <w:hideMark/>
+          </w:tcPr>
+          <w:p>
+            <w:pPr>
+              <w:rPr>
+                <w:rFonts w:ascii="Arial" w:hAnsi="Arial" w:cs="Arial"/>
+              </w:rPr>
+            </w:pPr>
+            <w:r>
+              <w:rPr>
+                <w:rFonts w:ascii="Arial" w:hAnsi="Arial" w:cs="Arial"/>
+                <w:b/>
+                <w:bCs/>
+              </w:rPr>
+              <w:lastRenderedPageBreak/>
+              <w:t>RF-03</w:t>
+            </w:r>
+          </w:p>
+        </w:tc>
+        <w:tc>
+          <w:tcPr>
+            <w:tcW w:w="0" w:type="auto"/>
+            <w:vAlign w:val="center"/>
+            <w:hideMark/>
+          </w:tcPr>
+          <w:p>
+            <w:pPr>
+              <w:rPr>
+                <w:rFonts w:ascii="Arial" w:hAnsi="Arial" w:cs="Arial"/>
+              </w:rPr>
+            </w:pPr>
+            <w:proofErr w:type="spellStart"/>
+            <w:r>
+              <w:rPr>
+                <w:rFonts w:ascii="Arial" w:hAnsi="Arial" w:cs="Arial"/>
+                <w:b/>
+                <w:bCs/>
+              </w:rPr>
+              <w:t>Feed</w:t>
+            </w:r>
+            <w:proofErr w:type="spellEnd"/>
+            <w:r>
+              <w:rPr>
+                <w:rFonts w:ascii="Arial" w:hAnsi="Arial" w:cs="Arial"/>
+                <w:b/>
+                <w:bCs/>
+              </w:rPr>
+              <w:t xml:space="preserve"> Cronológico con Filtrado por Relaciones y Visibilidad</w:t>
+            </w:r>
+          </w:p>
+        </w:tc>
+        <w:tc>
+          <w:tcPr>
+            <w:tcW w:w="0" w:type="auto"/>
+            <w:vAlign w:val="center"/>
+            <w:hideMark/>
+          </w:tcPr>
+          <w:p>
+            <w:pPr>
+              <w:rPr>
+                <w:rFonts w:ascii="Arial" w:hAnsi="Arial" w:cs="Arial"/>
+              </w:rPr>
+            </w:pPr>
+            <w:r>
+              <w:rPr>
+                <w:rFonts w:ascii="Arial" w:hAnsi="Arial" w:cs="Arial"/>
+              </w:rPr>
+              <w:t xml:space="preserve">Mostrar un </w:t>
+            </w:r>
+            <w:proofErr w:type="spellStart"/>
+            <w:r>
+              <w:rPr>
+                <w:rFonts w:ascii="Arial" w:hAnsi="Arial" w:cs="Arial"/>
+              </w:rPr>
+              <w:t>feed</w:t>
+            </w:r>
+            <w:proofErr w:type="spellEnd"/>
+            <w:r>
+              <w:rPr>
+                <w:rFonts w:ascii="Arial" w:hAnsi="Arial" w:cs="Arial"/>
+              </w:rPr>
+              <w:t xml:space="preserve"> ordenado cronológicamente aplicando filtros según la configuración de visibilidad y las relaciones de amistad del usuario.</w:t>
+            </w:r>
+          </w:p>
+        </w:tc>
+        <w:tc>
+          <w:tcPr>
+            <w:tcW w:w="0" w:type="auto"/>
+            <w:vAlign w:val="center"/>
+            <w:hideMark/>
+          </w:tcPr>
+          <w:p>
+            <w:pPr>
+              <w:rPr>
+                <w:rFonts w:ascii="Arial" w:hAnsi="Arial" w:cs="Arial"/>
+              </w:rPr>
+            </w:pPr>
+            <w:r>
+              <w:rPr>
+                <w:rFonts w:ascii="Arial" w:hAnsi="Arial" w:cs="Arial"/>
+              </w:rPr>
+              <w:t>Alta</w:t>
+            </w:r>
+          </w:p>
+        </w:tc>
+        <w:tc>
+          <w:tcPr>
+            <w:tcW w:w="0" w:type="auto"/>
+            <w:vAlign w:val="center"/>
+            <w:hideMark/>
+          </w:tcPr>
+          <w:p>
+            <w:pPr>
+              <w:rPr>
+                <w:rFonts w:ascii="Arial" w:hAnsi="Arial" w:cs="Arial"/>
+              </w:rPr>
+            </w:pPr>
+            <w:r>
+              <w:rPr>
+                <w:rFonts w:ascii="Arial" w:hAnsi="Arial" w:cs="Arial"/>
+              </w:rPr>
+              <w:t>Garantizar un buen rendimiento y mostrar únicamente contenido autorizado para cada usuario.</w:t>
+            </w:r>
+          </w:p>
+        </w:tc>
+        <w:tc>
+          <w:tcPr>
+            <w:tcW w:w="0" w:type="auto"/>
+            <w:vAlign w:val="center"/>
+            <w:hideMark/>
+          </w:tcPr>
+          <w:p>
+            <w:pPr>
+              <w:rPr>
+                <w:rFonts w:ascii="Arial" w:hAnsi="Arial" w:cs="Arial"/>
+              </w:rPr>
+            </w:pPr>
+            <w:r>
+              <w:rPr>
+                <w:rFonts w:ascii="Arial" w:hAnsi="Arial" w:cs="Arial"/>
+              </w:rPr>
+              <w:t>Implementar consultas optimizadas con filtros por visibilidad, amistad y facultad, además de paginación del contenido.</w:t>
+            </w:r>
+          </w:p>
+        </w:tc>
+      </w:tr>
+      <w:tr>
+        <w:trPr>
+          <w:tblCellSpacing w:w="15" w:type="dxa"/>
+        </w:trPr>
+        <w:tc>
+          <w:tcPr>
+            <w:tcW w:w="0" w:type="auto"/>
+            <w:vAlign w:val="center"/>
+            <w:hideMark/>
+          </w:tcPr>
+          <w:p>
+            <w:pPr>
+              <w:rPr>
+                <w:rFonts w:ascii="Arial" w:hAnsi="Arial" w:cs="Arial"/>
+              </w:rPr>
+            </w:pPr>
+            <w:r>
+              <w:rPr>
+                <w:rFonts w:ascii="Arial" w:hAnsi="Arial" w:cs="Arial"/>
+                <w:b/>
+                <w:bCs/>
+              </w:rPr>
+              <w:t>RF-04</w:t>
+            </w:r>
+          </w:p>
+        </w:tc>
+        <w:tc>
+          <w:tcPr>
+            <w:tcW w:w="0" w:type="auto"/>
+            <w:vAlign w:val="center"/>
+            <w:hideMark/>
+          </w:tcPr>
+          <w:p>
+            <w:pPr>
+              <w:rPr>
+                <w:rFonts w:ascii="Arial" w:hAnsi="Arial" w:cs="Arial"/>
+              </w:rPr>
+            </w:pPr>
+            <w:r>
+              <w:rPr>
+                <w:rFonts w:ascii="Arial" w:hAnsi="Arial" w:cs="Arial"/>
+                <w:b/>
+                <w:bCs/>
+              </w:rPr>
+              <w:t>Sistema de Me gusta en Publicaciones</w:t>
+            </w:r>
+          </w:p>
+        </w:tc>
+        <w:tc>
+          <w:tcPr>
+            <w:tcW w:w="0" w:type="auto"/>
+            <w:vAlign w:val="center"/>
+            <w:hideMark/>
+          </w:tcPr>
+          <w:p>
+            <w:pPr>
+              <w:rPr>
+                <w:rFonts w:ascii="Arial" w:hAnsi="Arial" w:cs="Arial"/>
+              </w:rPr>
+            </w:pPr>
+            <w:r>
+              <w:rPr>
+                <w:rFonts w:ascii="Arial" w:hAnsi="Arial" w:cs="Arial"/>
+              </w:rPr>
+              <w:t>Permitir a los usuarios reaccionar con "Me gusta" a las publicaciones y eliminar su reacción cuando lo deseen.</w:t>
+            </w:r>
+          </w:p>
+        </w:tc>
+        <w:tc>
+          <w:tcPr>
+            <w:tcW w:w="0" w:type="auto"/>
+            <w:vAlign w:val="center"/>
+            <w:hideMark/>
+          </w:tcPr>
+          <w:p>
+            <w:pPr>
+              <w:rPr>
+                <w:rFonts w:ascii="Arial" w:hAnsi="Arial" w:cs="Arial"/>
+              </w:rPr>
+            </w:pPr>
+            <w:r>
+              <w:rPr>
+                <w:rFonts w:ascii="Arial" w:hAnsi="Arial" w:cs="Arial"/>
+              </w:rPr>
+              <w:t>Alta</w:t>
+            </w:r>
+          </w:p>
+        </w:tc>
+        <w:tc>
+          <w:tcPr>
+            <w:tcW w:w="0" w:type="auto"/>
+            <w:vAlign w:val="center"/>
+            <w:hideMark/>
+          </w:tcPr>
+          <w:p>
+            <w:pPr>
+              <w:rPr>
+                <w:rFonts w:ascii="Arial" w:hAnsi="Arial" w:cs="Arial"/>
+              </w:rPr>
+            </w:pPr>
+            <w:r>
+              <w:rPr>
+                <w:rFonts w:ascii="Arial" w:hAnsi="Arial" w:cs="Arial"/>
+              </w:rPr>
+              <w:t>Evitar múltiples reacciones del mismo usuario sobre una publicación.</w:t>
+            </w:r>
+          </w:p>
+        </w:tc>
+        <w:tc>
+          <w:tcPr>
+            <w:tcW w:w="0" w:type="auto"/>
+            <w:vAlign w:val="center"/>
+            <w:hideMark/>
+          </w:tcPr>
+          <w:p>
+            <w:pPr>
+              <w:rPr>
+                <w:rFonts w:ascii="Arial" w:hAnsi="Arial" w:cs="Arial"/>
+              </w:rPr>
+            </w:pPr>
+            <w:r>
+              <w:rPr>
+                <w:rFonts w:ascii="Arial" w:hAnsi="Arial" w:cs="Arial"/>
+              </w:rPr>
+              <w:t>Implementar control de unicidad por usuario y publicación, actualizando el contador de forma dinámica.</w:t>
+            </w:r>
+          </w:p>
+        </w:tc>
+      </w:tr>
+      <w:tr>
+        <w:trPr>
+          <w:tblCellSpacing w:w="15" w:type="dxa"/>
+        </w:trPr>
+        <w:tc>
+          <w:tcPr>
+            <w:tcW w:w="0" w:type="auto"/>
+            <w:vAlign w:val="center"/>
+            <w:hideMark/>
+          </w:tcPr>
+          <w:p>
+            <w:pPr>
+              <w:rPr>
+                <w:rFonts w:ascii="Arial" w:hAnsi="Arial" w:cs="Arial"/>
+              </w:rPr>
+            </w:pPr>
+            <w:r>
+              <w:rPr>
+                <w:rFonts w:ascii="Arial" w:hAnsi="Arial" w:cs="Arial"/>
+                <w:b/>
+                <w:bCs/>
+              </w:rPr>
+              <w:t>RF-05</w:t>
+            </w:r>
+          </w:p>
+        </w:tc>
+        <w:tc>
+          <w:tcPr>
+            <w:tcW w:w="0" w:type="auto"/>
+            <w:vAlign w:val="center"/>
+            <w:hideMark/>
+          </w:tcPr>
+          <w:p>
+            <w:pPr>
+              <w:rPr>
+                <w:rFonts w:ascii="Arial" w:hAnsi="Arial" w:cs="Arial"/>
+              </w:rPr>
+            </w:pPr>
+            <w:r>
+              <w:rPr>
+                <w:rFonts w:ascii="Arial" w:hAnsi="Arial" w:cs="Arial"/>
+                <w:b/>
+                <w:bCs/>
+              </w:rPr>
+              <w:t>Comentarios en Publicaciones con Likes</w:t>
+            </w:r>
+          </w:p>
+        </w:tc>
+        <w:tc>
+          <w:tcPr>
+            <w:tcW w:w="0" w:type="auto"/>
+            <w:vAlign w:val="center"/>
+            <w:hideMark/>
+          </w:tcPr>
+          <w:p>
+            <w:pPr>
+              <w:rPr>
+                <w:rFonts w:ascii="Arial" w:hAnsi="Arial" w:cs="Arial"/>
+              </w:rPr>
+            </w:pPr>
+            <w:r>
+              <w:rPr>
+                <w:rFonts w:ascii="Arial" w:hAnsi="Arial" w:cs="Arial"/>
+              </w:rPr>
+              <w:t>Permitir agregar comentarios a las publicaciones y reaccionar con "Me gusta" sobre cada comentario.</w:t>
+            </w:r>
+          </w:p>
+        </w:tc>
+        <w:tc>
+          <w:tcPr>
+            <w:tcW w:w="0" w:type="auto"/>
+            <w:vAlign w:val="center"/>
+            <w:hideMark/>
+          </w:tcPr>
+          <w:p>
+            <w:pPr>
+              <w:rPr>
+                <w:rFonts w:ascii="Arial" w:hAnsi="Arial" w:cs="Arial"/>
+              </w:rPr>
+            </w:pPr>
+            <w:r>
+              <w:rPr>
+                <w:rFonts w:ascii="Arial" w:hAnsi="Arial" w:cs="Arial"/>
+              </w:rPr>
+              <w:t>Alta</w:t>
+            </w:r>
+          </w:p>
+        </w:tc>
+        <w:tc>
+          <w:tcPr>
+            <w:tcW w:w="0" w:type="auto"/>
+            <w:vAlign w:val="center"/>
+            <w:hideMark/>
+          </w:tcPr>
+          <w:p>
+            <w:pPr>
+              <w:rPr>
+                <w:rFonts w:ascii="Arial" w:hAnsi="Arial" w:cs="Arial"/>
+              </w:rPr>
+            </w:pPr>
+            <w:r>
+              <w:rPr>
+                <w:rFonts w:ascii="Arial" w:hAnsi="Arial" w:cs="Arial"/>
+              </w:rPr>
+              <w:t>Mantener la consistencia entre comentarios y reacciones sin afectar el rendimiento.</w:t>
+            </w:r>
+          </w:p>
+        </w:tc>
+        <w:tc>
+          <w:tcPr>
+            <w:tcW w:w="0" w:type="auto"/>
+            <w:vAlign w:val="center"/>
+            <w:hideMark/>
+          </w:tcPr>
+          <w:p>
+            <w:pPr>
+              <w:rPr>
+                <w:rFonts w:ascii="Arial" w:hAnsi="Arial" w:cs="Arial"/>
+              </w:rPr>
+            </w:pPr>
+            <w:r>
+              <w:rPr>
+                <w:rFonts w:ascii="Arial" w:hAnsi="Arial" w:cs="Arial"/>
+              </w:rPr>
+              <w:t>Implementar un módulo de comentarios con soporte para reacciones independientes y actualización dinámica.</w:t>
+            </w:r>
+          </w:p>
+        </w:tc>
+      </w:tr>
+      <w:tr>
+        <w:trPr>
+          <w:tblCellSpacing w:w="15" w:type="dxa"/>
+        </w:trPr>
+        <w:tc>
+          <w:tcPr>
+            <w:tcW w:w="0" w:type="auto"/>
+            <w:vAlign w:val="center"/>
+            <w:hideMark/>
+          </w:tcPr>
+          <w:p>
+            <w:pPr>
+              <w:rPr>
+                <w:rFonts w:ascii="Arial" w:hAnsi="Arial" w:cs="Arial"/>
+              </w:rPr>
+            </w:pPr>
+            <w:r>
+              <w:rPr>
+                <w:rFonts w:ascii="Arial" w:hAnsi="Arial" w:cs="Arial"/>
+                <w:b/>
+                <w:bCs/>
+              </w:rPr>
+              <w:t>RF-06</w:t>
+            </w:r>
+          </w:p>
+        </w:tc>
+        <w:tc>
+          <w:tcPr>
+            <w:tcW w:w="0" w:type="auto"/>
+            <w:vAlign w:val="center"/>
+            <w:hideMark/>
+          </w:tcPr>
+          <w:p>
+            <w:pPr>
+              <w:rPr>
+                <w:rFonts w:ascii="Arial" w:hAnsi="Arial" w:cs="Arial"/>
+              </w:rPr>
+            </w:pPr>
+            <w:r>
+              <w:rPr>
+                <w:rFonts w:ascii="Arial" w:hAnsi="Arial" w:cs="Arial"/>
+                <w:b/>
+                <w:bCs/>
+              </w:rPr>
+              <w:t>Gestión de Perfil de Usuario</w:t>
+            </w:r>
+          </w:p>
+        </w:tc>
+        <w:tc>
+          <w:tcPr>
+            <w:tcW w:w="0" w:type="auto"/>
+            <w:vAlign w:val="center"/>
+            <w:hideMark/>
+          </w:tcPr>
+          <w:p>
+            <w:pPr>
+              <w:rPr>
+                <w:rFonts w:ascii="Arial" w:hAnsi="Arial" w:cs="Arial"/>
+              </w:rPr>
+            </w:pPr>
+            <w:r>
+              <w:rPr>
+                <w:rFonts w:ascii="Arial" w:hAnsi="Arial" w:cs="Arial"/>
+              </w:rPr>
+              <w:t>Permitir visualizar y editar la información del perfil, incluyendo biografía, foto de perfil, foto de portada e información académica.</w:t>
+            </w:r>
+          </w:p>
+        </w:tc>
+        <w:tc>
+          <w:tcPr>
+            <w:tcW w:w="0" w:type="auto"/>
+            <w:vAlign w:val="center"/>
+            <w:hideMark/>
+          </w:tcPr>
+          <w:p>
+            <w:pPr>
+              <w:rPr>
+                <w:rFonts w:ascii="Arial" w:hAnsi="Arial" w:cs="Arial"/>
+              </w:rPr>
+            </w:pPr>
+            <w:r>
+              <w:rPr>
+                <w:rFonts w:ascii="Arial" w:hAnsi="Arial" w:cs="Arial"/>
+              </w:rPr>
+              <w:t>Alta</w:t>
+            </w:r>
+          </w:p>
+        </w:tc>
+        <w:tc>
+          <w:tcPr>
+            <w:tcW w:w="0" w:type="auto"/>
+            <w:vAlign w:val="center"/>
+            <w:hideMark/>
+          </w:tcPr>
+          <w:p>
+            <w:pPr>
+              <w:rPr>
+                <w:rFonts w:ascii="Arial" w:hAnsi="Arial" w:cs="Arial"/>
+              </w:rPr>
+            </w:pPr>
+            <w:r>
+              <w:rPr>
+                <w:rFonts w:ascii="Arial" w:hAnsi="Arial" w:cs="Arial"/>
+              </w:rPr>
+              <w:t>Garantizar que la información del usuario permanezca actualizada y que las imágenes se almacenen correctamente.</w:t>
+            </w:r>
+          </w:p>
+        </w:tc>
+        <w:tc>
+          <w:tcPr>
+            <w:tcW w:w="0" w:type="auto"/>
+            <w:vAlign w:val="center"/>
+            <w:hideMark/>
+          </w:tcPr>
+          <w:p>
+            <w:pPr>
+              <w:rPr>
+                <w:rFonts w:ascii="Arial" w:hAnsi="Arial" w:cs="Arial"/>
+              </w:rPr>
+            </w:pPr>
+            <w:r>
+              <w:rPr>
+                <w:rFonts w:ascii="Arial" w:hAnsi="Arial" w:cs="Arial"/>
+              </w:rPr>
+              <w:t>Implementar un microservicio de perfiles con almacenamiento de imágenes y servicios de actualización mediante API REST.</w:t>
+            </w:r>
+          </w:p>
+        </w:tc>
+      </w:tr>
+      <w:tr>
+        <w:trPr>
+          <w:tblCellSpacing w:w="15" w:type="dxa"/>
+        </w:trPr>
+        <w:tc>
+          <w:tcPr>
+            <w:tcW w:w="0" w:type="auto"/>
+            <w:vAlign w:val="center"/>
+            <w:hideMark/>
+          </w:tcPr>
+          <w:p>
+            <w:pPr>
+              <w:rPr>
+                <w:rFonts w:ascii="Arial" w:hAnsi="Arial" w:cs="Arial"/>
+              </w:rPr>
+            </w:pPr>
+            <w:r>
+              <w:rPr>
+                <w:rFonts w:ascii="Arial" w:hAnsi="Arial" w:cs="Arial"/>
+                <w:b/>
+                <w:bCs/>
+              </w:rPr>
+              <w:lastRenderedPageBreak/>
+              <w:t>RF-07</w:t>
+            </w:r>
+          </w:p>
+        </w:tc>
+        <w:tc>
+          <w:tcPr>
+            <w:tcW w:w="0" w:type="auto"/>
+            <w:vAlign w:val="center"/>
+            <w:hideMark/>
+          </w:tcPr>
+          <w:p>
+            <w:pPr>
+              <w:rPr>
+                <w:rFonts w:ascii="Arial" w:hAnsi="Arial" w:cs="Arial"/>
+              </w:rPr>
+            </w:pPr>
+            <w:r>
+              <w:rPr>
+                <w:rFonts w:ascii="Arial" w:hAnsi="Arial" w:cs="Arial"/>
+                <w:b/>
+                <w:bCs/>
+              </w:rPr>
+              <w:t>Directorio de Amigos con Solicitudes</w:t>
+            </w:r>
+          </w:p>
+        </w:tc>
+        <w:tc>
+          <w:tcPr>
+            <w:tcW w:w="0" w:type="auto"/>
+            <w:vAlign w:val="center"/>
+            <w:hideMark/>
+          </w:tcPr>
+          <w:p>
+            <w:pPr>
+              <w:rPr>
+                <w:rFonts w:ascii="Arial" w:hAnsi="Arial" w:cs="Arial"/>
+              </w:rPr>
+            </w:pPr>
+            <w:r>
+              <w:rPr>
+                <w:rFonts w:ascii="Arial" w:hAnsi="Arial" w:cs="Arial"/>
+              </w:rPr>
+              <w:t>Permitir buscar usuarios, enviar solicitudes de amistad, aceptarlas o rechazarlas y visualizar la lista de amigos.</w:t>
+            </w:r>
+          </w:p>
+        </w:tc>
+        <w:tc>
+          <w:tcPr>
+            <w:tcW w:w="0" w:type="auto"/>
+            <w:vAlign w:val="center"/>
+            <w:hideMark/>
+          </w:tcPr>
+          <w:p>
+            <w:pPr>
+              <w:rPr>
+                <w:rFonts w:ascii="Arial" w:hAnsi="Arial" w:cs="Arial"/>
+              </w:rPr>
+            </w:pPr>
+            <w:r>
+              <w:rPr>
+                <w:rFonts w:ascii="Arial" w:hAnsi="Arial" w:cs="Arial"/>
+              </w:rPr>
+              <w:t>Alta</w:t>
+            </w:r>
+          </w:p>
+        </w:tc>
+        <w:tc>
+          <w:tcPr>
+            <w:tcW w:w="0" w:type="auto"/>
+            <w:vAlign w:val="center"/>
+            <w:hideMark/>
+          </w:tcPr>
+          <w:p>
+            <w:pPr>
+              <w:rPr>
+                <w:rFonts w:ascii="Arial" w:hAnsi="Arial" w:cs="Arial"/>
+              </w:rPr>
+            </w:pPr>
+            <w:r>
+              <w:rPr>
+                <w:rFonts w:ascii="Arial" w:hAnsi="Arial" w:cs="Arial"/>
+              </w:rPr>
+              <w:t>Gestionar correctamente el estado de las solicitudes y evitar relaciones duplicadas.</w:t>
+            </w:r>
+          </w:p>
+        </w:tc>
+        <w:tc>
+          <w:tcPr>
+            <w:tcW w:w="0" w:type="auto"/>
+            <w:vAlign w:val="center"/>
+            <w:hideMark/>
+          </w:tcPr>
+          <w:p>
+            <w:pPr>
+              <w:rPr>
+                <w:rFonts w:ascii="Arial" w:hAnsi="Arial" w:cs="Arial"/>
+              </w:rPr>
+            </w:pPr>
+            <w:r>
+              <w:rPr>
+                <w:rFonts w:ascii="Arial" w:hAnsi="Arial" w:cs="Arial"/>
+              </w:rPr>
+              <w:t>Implementar un microservicio de amistades con estados de solicitud, búsqueda por nombre y filtros académicos.</w:t>
+            </w:r>
+          </w:p>
+        </w:tc>
+      </w:tr>
+      <w:tr>
+        <w:trPr>
+          <w:tblCellSpacing w:w="15" w:type="dxa"/>
+        </w:trPr>
+        <w:tc>
+          <w:tcPr>
+            <w:tcW w:w="0" w:type="auto"/>
+            <w:vAlign w:val="center"/>
+            <w:hideMark/>
+          </w:tcPr>
+          <w:p>
+            <w:pPr>
+              <w:rPr>
+                <w:rFonts w:ascii="Arial" w:hAnsi="Arial" w:cs="Arial"/>
+              </w:rPr>
+            </w:pPr>
+            <w:r>
+              <w:rPr>
+                <w:rFonts w:ascii="Arial" w:hAnsi="Arial" w:cs="Arial"/>
+                <w:b/>
+                <w:bCs/>
+              </w:rPr>
+              <w:t>RF-08</w:t>
+            </w:r>
+          </w:p>
+        </w:tc>
+        <w:tc>
+          <w:tcPr>
+            <w:tcW w:w="0" w:type="auto"/>
+            <w:vAlign w:val="center"/>
+            <w:hideMark/>
+          </w:tcPr>
+          <w:p>
+            <w:pPr>
+              <w:rPr>
+                <w:rFonts w:ascii="Arial" w:hAnsi="Arial" w:cs="Arial"/>
+              </w:rPr>
+            </w:pPr>
+            <w:r>
+              <w:rPr>
+                <w:rFonts w:ascii="Arial" w:hAnsi="Arial" w:cs="Arial"/>
+                <w:b/>
+                <w:bCs/>
+              </w:rPr>
+              <w:t>Chat Privado entre Amigos</w:t>
+            </w:r>
+          </w:p>
+        </w:tc>
+        <w:tc>
+          <w:tcPr>
+            <w:tcW w:w="0" w:type="auto"/>
+            <w:vAlign w:val="center"/>
+            <w:hideMark/>
+          </w:tcPr>
+          <w:p>
+            <w:pPr>
+              <w:rPr>
+                <w:rFonts w:ascii="Arial" w:hAnsi="Arial" w:cs="Arial"/>
+              </w:rPr>
+            </w:pPr>
+            <w:r>
+              <w:rPr>
+                <w:rFonts w:ascii="Arial" w:hAnsi="Arial" w:cs="Arial"/>
+              </w:rPr>
+              <w:t>Permitir conversaciones privadas entre usuarios con amistad confirmada, incluyendo envío de texto e imágenes.</w:t>
+            </w:r>
+          </w:p>
+        </w:tc>
+        <w:tc>
+          <w:tcPr>
+            <w:tcW w:w="0" w:type="auto"/>
+            <w:vAlign w:val="center"/>
+            <w:hideMark/>
+          </w:tcPr>
+          <w:p>
+            <w:pPr>
+              <w:rPr>
+                <w:rFonts w:ascii="Arial" w:hAnsi="Arial" w:cs="Arial"/>
+              </w:rPr>
+            </w:pPr>
+            <w:r>
+              <w:rPr>
+                <w:rFonts w:ascii="Arial" w:hAnsi="Arial" w:cs="Arial"/>
+              </w:rPr>
+              <w:t>Alta</w:t>
+            </w:r>
+          </w:p>
+        </w:tc>
+        <w:tc>
+          <w:tcPr>
+            <w:tcW w:w="0" w:type="auto"/>
+            <w:vAlign w:val="center"/>
+            <w:hideMark/>
+          </w:tcPr>
+          <w:p>
+            <w:pPr>
+              <w:rPr>
+                <w:rFonts w:ascii="Arial" w:hAnsi="Arial" w:cs="Arial"/>
+              </w:rPr>
+            </w:pPr>
+            <w:r>
+              <w:rPr>
+                <w:rFonts w:ascii="Arial" w:hAnsi="Arial" w:cs="Arial"/>
+              </w:rPr>
+              <w:t>Garantizar privacidad, rapidez en la actualización de mensajes y almacenamiento seguro.</w:t>
+            </w:r>
+          </w:p>
+        </w:tc>
+        <w:tc>
+          <w:tcPr>
+            <w:tcW w:w="0" w:type="auto"/>
+            <w:vAlign w:val="center"/>
+            <w:hideMark/>
+          </w:tcPr>
+          <w:p>
+            <w:pPr>
+              <w:rPr>
+                <w:rFonts w:ascii="Arial" w:hAnsi="Arial" w:cs="Arial"/>
+              </w:rPr>
+            </w:pPr>
+            <w:r>
+              <w:rPr>
+                <w:rFonts w:ascii="Arial" w:hAnsi="Arial" w:cs="Arial"/>
+              </w:rPr>
+              <w:t>Implementar un microservicio de mensajería con sondeo periódico (</w:t>
+            </w:r>
+            <w:proofErr w:type="spellStart"/>
+            <w:r>
+              <w:rPr>
+                <w:rFonts w:ascii="Arial" w:hAnsi="Arial" w:cs="Arial"/>
+              </w:rPr>
+              <w:t>polling</w:t>
+            </w:r>
+            <w:proofErr w:type="spellEnd"/>
+            <w:r>
+              <w:rPr>
+                <w:rFonts w:ascii="Arial" w:hAnsi="Arial" w:cs="Arial"/>
+              </w:rPr>
+              <w:t>) y almacenamiento de archivos multimedia.</w:t>
+            </w:r>
+          </w:p>
+        </w:tc>
+      </w:tr>
+      <w:tr>
+        <w:trPr>
+          <w:tblCellSpacing w:w="15" w:type="dxa"/>
+        </w:trPr>
+        <w:tc>
+          <w:tcPr>
+            <w:tcW w:w="0" w:type="auto"/>
+            <w:vAlign w:val="center"/>
+            <w:hideMark/>
+          </w:tcPr>
+          <w:p>
+            <w:pPr>
+              <w:rPr>
+                <w:rFonts w:ascii="Arial" w:hAnsi="Arial" w:cs="Arial"/>
+              </w:rPr>
+            </w:pPr>
+            <w:r>
+              <w:rPr>
+                <w:rFonts w:ascii="Arial" w:hAnsi="Arial" w:cs="Arial"/>
+                <w:b/>
+                <w:bCs/>
+              </w:rPr>
+              <w:t>RF-09</w:t>
+            </w:r>
+          </w:p>
+        </w:tc>
+        <w:tc>
+          <w:tcPr>
+            <w:tcW w:w="0" w:type="auto"/>
+            <w:vAlign w:val="center"/>
+            <w:hideMark/>
+          </w:tcPr>
+          <w:p>
+            <w:pPr>
+              <w:rPr>
+                <w:rFonts w:ascii="Arial" w:hAnsi="Arial" w:cs="Arial"/>
+              </w:rPr>
+            </w:pPr>
+            <w:r>
+              <w:rPr>
+                <w:rFonts w:ascii="Arial" w:hAnsi="Arial" w:cs="Arial"/>
+                <w:b/>
+                <w:bCs/>
+              </w:rPr>
+              <w:t>Panel de Administración</w:t>
+            </w:r>
+          </w:p>
+        </w:tc>
+        <w:tc>
+          <w:tcPr>
+            <w:tcW w:w="0" w:type="auto"/>
+            <w:vAlign w:val="center"/>
+            <w:hideMark/>
+          </w:tcPr>
+          <w:p>
+            <w:pPr>
+              <w:rPr>
+                <w:rFonts w:ascii="Arial" w:hAnsi="Arial" w:cs="Arial"/>
+              </w:rPr>
+            </w:pPr>
+            <w:r>
+              <w:rPr>
+                <w:rFonts w:ascii="Arial" w:hAnsi="Arial" w:cs="Arial"/>
+              </w:rPr>
+              <w:t>Permitir a los administradores gestionar usuarios, modificar roles, bloquear cuentas y moderar publicaciones y comentarios.</w:t>
+            </w:r>
+          </w:p>
+        </w:tc>
+        <w:tc>
+          <w:tcPr>
+            <w:tcW w:w="0" w:type="auto"/>
+            <w:vAlign w:val="center"/>
+            <w:hideMark/>
+          </w:tcPr>
+          <w:p>
+            <w:pPr>
+              <w:rPr>
+                <w:rFonts w:ascii="Arial" w:hAnsi="Arial" w:cs="Arial"/>
+              </w:rPr>
+            </w:pPr>
+            <w:r>
+              <w:rPr>
+                <w:rFonts w:ascii="Arial" w:hAnsi="Arial" w:cs="Arial"/>
+              </w:rPr>
+              <w:t>Alta</w:t>
+            </w:r>
+          </w:p>
+        </w:tc>
+        <w:tc>
+          <w:tcPr>
+            <w:tcW w:w="0" w:type="auto"/>
+            <w:vAlign w:val="center"/>
+            <w:hideMark/>
+          </w:tcPr>
+          <w:p>
+            <w:pPr>
+              <w:rPr>
+                <w:rFonts w:ascii="Arial" w:hAnsi="Arial" w:cs="Arial"/>
+              </w:rPr>
+            </w:pPr>
+            <w:r>
+              <w:rPr>
+                <w:rFonts w:ascii="Arial" w:hAnsi="Arial" w:cs="Arial"/>
+              </w:rPr>
+              <w:t>Restringir completamente el acceso al panel únicamente a usuarios administradores.</w:t>
+            </w:r>
+          </w:p>
+        </w:tc>
+        <w:tc>
+          <w:tcPr>
+            <w:tcW w:w="0" w:type="auto"/>
+            <w:vAlign w:val="center"/>
+            <w:hideMark/>
+          </w:tcPr>
+          <w:p>
+            <w:pPr>
+              <w:rPr>
+                <w:rFonts w:ascii="Arial" w:hAnsi="Arial" w:cs="Arial"/>
+              </w:rPr>
+            </w:pPr>
+            <w:r>
+              <w:rPr>
+                <w:rFonts w:ascii="Arial" w:hAnsi="Arial" w:cs="Arial"/>
+              </w:rPr>
+              <w:t>Implementar control de acceso basado en roles (RBAC) y un panel administrativo protegido mediante JWT.</w:t>
+            </w:r>
+          </w:p>
+        </w:tc>
+      </w:tr>
+      <w:tr>
+        <w:trPr>
+          <w:tblCellSpacing w:w="15" w:type="dxa"/>
+        </w:trPr>
+        <w:tc>
+          <w:tcPr>
+            <w:tcW w:w="0" w:type="auto"/>
+            <w:vAlign w:val="center"/>
+            <w:hideMark/>
+          </w:tcPr>
+          <w:p>
+            <w:pPr>
+              <w:rPr>
+                <w:rFonts w:ascii="Arial" w:hAnsi="Arial" w:cs="Arial"/>
+              </w:rPr>
+            </w:pPr>
+            <w:r>
+              <w:rPr>
+                <w:rFonts w:ascii="Arial" w:hAnsi="Arial" w:cs="Arial"/>
+                <w:b/>
+                <w:bCs/>
+              </w:rPr>
+              <w:t>RF-10</w:t>
+            </w:r>
+          </w:p>
+        </w:tc>
+        <w:tc>
+          <w:tcPr>
+            <w:tcW w:w="0" w:type="auto"/>
+            <w:vAlign w:val="center"/>
+            <w:hideMark/>
+          </w:tcPr>
+          <w:p>
+            <w:pPr>
+              <w:rPr>
+                <w:rFonts w:ascii="Arial" w:hAnsi="Arial" w:cs="Arial"/>
+              </w:rPr>
+            </w:pPr>
+            <w:r>
+              <w:rPr>
+                <w:rFonts w:ascii="Arial" w:hAnsi="Arial" w:cs="Arial"/>
+                <w:b/>
+                <w:bCs/>
+              </w:rPr>
+              <w:t>Informe de Contenido</w:t>
+            </w:r>
+          </w:p>
+        </w:tc>
+        <w:tc>
+          <w:tcPr>
+            <w:tcW w:w="0" w:type="auto"/>
+            <w:vAlign w:val="center"/>
+            <w:hideMark/>
+          </w:tcPr>
+          <w:p>
+            <w:pPr>
+              <w:rPr>
+                <w:rFonts w:ascii="Arial" w:hAnsi="Arial" w:cs="Arial"/>
+              </w:rPr>
+            </w:pPr>
+            <w:r>
+              <w:rPr>
+                <w:rFonts w:ascii="Arial" w:hAnsi="Arial" w:cs="Arial"/>
+              </w:rPr>
+              <w:t>Permitir reportar publicaciones, comentarios y mensajes que incumplan las normas de la comunidad universitaria.</w:t>
+            </w:r>
+          </w:p>
+        </w:tc>
+        <w:tc>
+          <w:tcPr>
+            <w:tcW w:w="0" w:type="auto"/>
+            <w:vAlign w:val="center"/>
+            <w:hideMark/>
+          </w:tcPr>
+          <w:p>
+            <w:pPr>
+              <w:rPr>
+                <w:rFonts w:ascii="Arial" w:hAnsi="Arial" w:cs="Arial"/>
+              </w:rPr>
+            </w:pPr>
+            <w:r>
+              <w:rPr>
+                <w:rFonts w:ascii="Arial" w:hAnsi="Arial" w:cs="Arial"/>
+              </w:rPr>
+              <w:t>Media</w:t>
+            </w:r>
+          </w:p>
+        </w:tc>
+        <w:tc>
+          <w:tcPr>
+            <w:tcW w:w="0" w:type="auto"/>
+            <w:vAlign w:val="center"/>
+            <w:hideMark/>
+          </w:tcPr>
+          <w:p>
+            <w:pPr>
+              <w:rPr>
+                <w:rFonts w:ascii="Arial" w:hAnsi="Arial" w:cs="Arial"/>
+              </w:rPr>
+            </w:pPr>
+            <w:r>
+              <w:rPr>
+                <w:rFonts w:ascii="Arial" w:hAnsi="Arial" w:cs="Arial"/>
+              </w:rPr>
+              <w:t>Gestionar eficientemente los reportes y facilitar el proceso de revisión por parte de los administradores.</w:t>
+            </w:r>
+          </w:p>
+        </w:tc>
+        <w:tc>
+          <w:tcPr>
+            <w:tcW w:w="0" w:type="auto"/>
+            <w:vAlign w:val="center"/>
+            <w:hideMark/>
+          </w:tcPr>
+          <w:p>
+            <w:pPr>
+              <w:rPr>
+                <w:rFonts w:ascii="Arial" w:hAnsi="Arial" w:cs="Arial"/>
+              </w:rPr>
+            </w:pPr>
+            <w:r>
+              <w:rPr>
+                <w:rFonts w:ascii="Arial" w:hAnsi="Arial" w:cs="Arial"/>
+              </w:rPr>
+              <w:t>Implementar un módulo de reportes con estados de seguimiento y panel de revisión para administradores.</w:t>
+            </w:r>
+          </w:p>
+        </w:tc>
+      </w:tr>
+      <w:tr>
+        <w:trPr>
+          <w:tblCellSpacing w:w="15" w:type="dxa"/>
+        </w:trPr>
+        <w:tc>
+          <w:tcPr>
+            <w:tcW w:w="0" w:type="auto"/>
+            <w:vAlign w:val="center"/>
+            <w:hideMark/>
+          </w:tcPr>
+          <w:p>
+            <w:pPr>
+              <w:rPr>
+                <w:rFonts w:ascii="Arial" w:hAnsi="Arial" w:cs="Arial"/>
+              </w:rPr>
+            </w:pPr>
+            <w:r>
+              <w:rPr>
+                <w:rFonts w:ascii="Arial" w:hAnsi="Arial" w:cs="Arial"/>
+                <w:b/>
+                <w:bCs/>
+              </w:rPr>
+              <w:t>RF-11</w:t>
+            </w:r>
+          </w:p>
+        </w:tc>
+        <w:tc>
+          <w:tcPr>
+            <w:tcW w:w="0" w:type="auto"/>
+            <w:vAlign w:val="center"/>
+            <w:hideMark/>
+          </w:tcPr>
+          <w:p>
+            <w:pPr>
+              <w:rPr>
+                <w:rFonts w:ascii="Arial" w:hAnsi="Arial" w:cs="Arial"/>
+              </w:rPr>
+            </w:pPr>
+            <w:r>
+              <w:rPr>
+                <w:rFonts w:ascii="Arial" w:hAnsi="Arial" w:cs="Arial"/>
+                <w:b/>
+                <w:bCs/>
+              </w:rPr>
+              <w:t>Grupos de Comunidad</w:t>
+            </w:r>
+          </w:p>
+        </w:tc>
+        <w:tc>
+          <w:tcPr>
+            <w:tcW w:w="0" w:type="auto"/>
+            <w:vAlign w:val="center"/>
+            <w:hideMark/>
+          </w:tcPr>
+          <w:p>
+            <w:pPr>
+              <w:rPr>
+                <w:rFonts w:ascii="Arial" w:hAnsi="Arial" w:cs="Arial"/>
+              </w:rPr>
+            </w:pPr>
+            <w:r>
+              <w:rPr>
+                <w:rFonts w:ascii="Arial" w:hAnsi="Arial" w:cs="Arial"/>
+              </w:rPr>
+              <w:t>Permitir crear grupos públicos o privados con administradores, miembros y solicitudes de ingreso.</w:t>
+            </w:r>
+          </w:p>
+        </w:tc>
+        <w:tc>
+          <w:tcPr>
+            <w:tcW w:w="0" w:type="auto"/>
+            <w:vAlign w:val="center"/>
+            <w:hideMark/>
+          </w:tcPr>
+          <w:p>
+            <w:pPr>
+              <w:rPr>
+                <w:rFonts w:ascii="Arial" w:hAnsi="Arial" w:cs="Arial"/>
+              </w:rPr>
+            </w:pPr>
+            <w:r>
+              <w:rPr>
+                <w:rFonts w:ascii="Arial" w:hAnsi="Arial" w:cs="Arial"/>
+              </w:rPr>
+              <w:t>Media</w:t>
+            </w:r>
+          </w:p>
+        </w:tc>
+        <w:tc>
+          <w:tcPr>
+            <w:tcW w:w="0" w:type="auto"/>
+            <w:vAlign w:val="center"/>
+            <w:hideMark/>
+          </w:tcPr>
+          <w:p>
+            <w:pPr>
+              <w:rPr>
+                <w:rFonts w:ascii="Arial" w:hAnsi="Arial" w:cs="Arial"/>
+              </w:rPr>
+            </w:pPr>
+            <w:r>
+              <w:rPr>
+                <w:rFonts w:ascii="Arial" w:hAnsi="Arial" w:cs="Arial"/>
+              </w:rPr>
+              <w:t>Gestionar correctamente los permisos y la privacidad de cada grupo.</w:t>
+            </w:r>
+          </w:p>
+        </w:tc>
+        <w:tc>
+          <w:tcPr>
+            <w:tcW w:w="0" w:type="auto"/>
+            <w:vAlign w:val="center"/>
+            <w:hideMark/>
+          </w:tcPr>
+          <w:p>
+            <w:pPr>
+              <w:rPr>
+                <w:rFonts w:ascii="Arial" w:hAnsi="Arial" w:cs="Arial"/>
+              </w:rPr>
+            </w:pPr>
+            <w:r>
+              <w:rPr>
+                <w:rFonts w:ascii="Arial" w:hAnsi="Arial" w:cs="Arial"/>
+              </w:rPr>
+              <w:t xml:space="preserve">Implementar un microservicio de grupos con control de membresías, roles y </w:t>
+            </w:r>
+            <w:r>
+              <w:rPr>
+                <w:rFonts w:ascii="Arial" w:hAnsi="Arial" w:cs="Arial"/>
+              </w:rPr>
+              <w:lastRenderedPageBreak/>
+              <w:t>solicitudes de acceso.</w:t>
+            </w:r>
+          </w:p>
+        </w:tc>
+      </w:tr>
+      <w:tr>
+        <w:trPr>
+          <w:tblCellSpacing w:w="15" w:type="dxa"/>
+        </w:trPr>
+        <w:tc>
+          <w:tcPr>
+            <w:tcW w:w="0" w:type="auto"/>
+            <w:vAlign w:val="center"/>
+            <w:hideMark/>
+          </w:tcPr>
+          <w:p>
+            <w:pPr>
+              <w:rPr>
+                <w:rFonts w:ascii="Arial" w:hAnsi="Arial" w:cs="Arial"/>
+              </w:rPr>
+            </w:pPr>
+            <w:r>
+              <w:rPr>
+                <w:rFonts w:ascii="Arial" w:hAnsi="Arial" w:cs="Arial"/>
+                <w:b/>
+                <w:bCs/>
+              </w:rPr>
+              <w:lastRenderedPageBreak/>
+              <w:t>RF-12</w:t>
+            </w:r>
+          </w:p>
+        </w:tc>
+        <w:tc>
+          <w:tcPr>
+            <w:tcW w:w="0" w:type="auto"/>
+            <w:vAlign w:val="center"/>
+            <w:hideMark/>
+          </w:tcPr>
+          <w:p>
+            <w:pPr>
+              <w:rPr>
+                <w:rFonts w:ascii="Arial" w:hAnsi="Arial" w:cs="Arial"/>
+              </w:rPr>
+            </w:pPr>
+            <w:r>
+              <w:rPr>
+                <w:rFonts w:ascii="Arial" w:hAnsi="Arial" w:cs="Arial"/>
+                <w:b/>
+                <w:bCs/>
+              </w:rPr>
+              <w:t>Bloqueo entre Usuarios</w:t>
+            </w:r>
+          </w:p>
+        </w:tc>
+        <w:tc>
+          <w:tcPr>
+            <w:tcW w:w="0" w:type="auto"/>
+            <w:vAlign w:val="center"/>
+            <w:hideMark/>
+          </w:tcPr>
+          <w:p>
+            <w:pPr>
+              <w:rPr>
+                <w:rFonts w:ascii="Arial" w:hAnsi="Arial" w:cs="Arial"/>
+              </w:rPr>
+            </w:pPr>
+            <w:r>
+              <w:rPr>
+                <w:rFonts w:ascii="Arial" w:hAnsi="Arial" w:cs="Arial"/>
+              </w:rPr>
+              <w:t>Permitir que un usuario bloquee a otro, restringiendo cualquier interacción entre ambos.</w:t>
+            </w:r>
+          </w:p>
+        </w:tc>
+        <w:tc>
+          <w:tcPr>
+            <w:tcW w:w="0" w:type="auto"/>
+            <w:vAlign w:val="center"/>
+            <w:hideMark/>
+          </w:tcPr>
+          <w:p>
+            <w:pPr>
+              <w:rPr>
+                <w:rFonts w:ascii="Arial" w:hAnsi="Arial" w:cs="Arial"/>
+              </w:rPr>
+            </w:pPr>
+            <w:r>
+              <w:rPr>
+                <w:rFonts w:ascii="Arial" w:hAnsi="Arial" w:cs="Arial"/>
+              </w:rPr>
+              <w:t>Media</w:t>
+            </w:r>
+          </w:p>
+        </w:tc>
+        <w:tc>
+          <w:tcPr>
+            <w:tcW w:w="0" w:type="auto"/>
+            <w:vAlign w:val="center"/>
+            <w:hideMark/>
+          </w:tcPr>
+          <w:p>
+            <w:pPr>
+              <w:rPr>
+                <w:rFonts w:ascii="Arial" w:hAnsi="Arial" w:cs="Arial"/>
+              </w:rPr>
+            </w:pPr>
+            <w:r>
+              <w:rPr>
+                <w:rFonts w:ascii="Arial" w:hAnsi="Arial" w:cs="Arial"/>
+              </w:rPr>
+              <w:t>Evitar que los usuarios bloqueados puedan comunicarse o visualizar contenido restringido.</w:t>
+            </w:r>
+          </w:p>
+        </w:tc>
+        <w:tc>
+          <w:tcPr>
+            <w:tcW w:w="0" w:type="auto"/>
+            <w:vAlign w:val="center"/>
+            <w:hideMark/>
+          </w:tcPr>
+          <w:p>
+            <w:pPr>
+              <w:rPr>
+                <w:rFonts w:ascii="Arial" w:hAnsi="Arial" w:cs="Arial"/>
+              </w:rPr>
+            </w:pPr>
+            <w:r>
+              <w:rPr>
+                <w:rFonts w:ascii="Arial" w:hAnsi="Arial" w:cs="Arial"/>
+              </w:rPr>
+              <w:t>Implementar reglas de bloqueo aplicadas a publicaciones, chat, solicitudes de amistad y demás interacciones sociales.</w:t>
+            </w:r>
+          </w:p>
+        </w:tc>
+      </w:tr>
+      <w:tr>
+        <w:trPr>
+          <w:tblCellSpacing w:w="15" w:type="dxa"/>
+        </w:trPr>
+        <w:tc>
+          <w:tcPr>
+            <w:tcW w:w="0" w:type="auto"/>
+            <w:vAlign w:val="center"/>
+            <w:hideMark/>
+          </w:tcPr>
+          <w:p>
+            <w:pPr>
+              <w:rPr>
+                <w:rFonts w:ascii="Arial" w:hAnsi="Arial" w:cs="Arial"/>
+              </w:rPr>
+            </w:pPr>
+            <w:r>
+              <w:rPr>
+                <w:rFonts w:ascii="Arial" w:hAnsi="Arial" w:cs="Arial"/>
+                <w:b/>
+                <w:bCs/>
+              </w:rPr>
+              <w:t>RF-13</w:t>
+            </w:r>
+          </w:p>
+        </w:tc>
+        <w:tc>
+          <w:tcPr>
+            <w:tcW w:w="0" w:type="auto"/>
+            <w:vAlign w:val="center"/>
+            <w:hideMark/>
+          </w:tcPr>
+          <w:p>
+            <w:pPr>
+              <w:rPr>
+                <w:rFonts w:ascii="Arial" w:hAnsi="Arial" w:cs="Arial"/>
+              </w:rPr>
+            </w:pPr>
+            <w:r>
+              <w:rPr>
+                <w:rFonts w:ascii="Arial" w:hAnsi="Arial" w:cs="Arial"/>
+                <w:b/>
+                <w:bCs/>
+              </w:rPr>
+              <w:t>Moderación Automática de Contenido</w:t>
+            </w:r>
+          </w:p>
+        </w:tc>
+        <w:tc>
+          <w:tcPr>
+            <w:tcW w:w="0" w:type="auto"/>
+            <w:vAlign w:val="center"/>
+            <w:hideMark/>
+          </w:tcPr>
+          <w:p>
+            <w:pPr>
+              <w:rPr>
+                <w:rFonts w:ascii="Arial" w:hAnsi="Arial" w:cs="Arial"/>
+              </w:rPr>
+            </w:pPr>
+            <w:r>
+              <w:rPr>
+                <w:rFonts w:ascii="Arial" w:hAnsi="Arial" w:cs="Arial"/>
+              </w:rPr>
+              <w:t>Validar automáticamente publicaciones, comentarios y mensajes utilizando un diccionario de palabras restringidas.</w:t>
+            </w:r>
+          </w:p>
+        </w:tc>
+        <w:tc>
+          <w:tcPr>
+            <w:tcW w:w="0" w:type="auto"/>
+            <w:vAlign w:val="center"/>
+            <w:hideMark/>
+          </w:tcPr>
+          <w:p>
+            <w:pPr>
+              <w:rPr>
+                <w:rFonts w:ascii="Arial" w:hAnsi="Arial" w:cs="Arial"/>
+              </w:rPr>
+            </w:pPr>
+            <w:r>
+              <w:rPr>
+                <w:rFonts w:ascii="Arial" w:hAnsi="Arial" w:cs="Arial"/>
+              </w:rPr>
+              <w:t>Alta</w:t>
+            </w:r>
+          </w:p>
+        </w:tc>
+        <w:tc>
+          <w:tcPr>
+            <w:tcW w:w="0" w:type="auto"/>
+            <w:vAlign w:val="center"/>
+            <w:hideMark/>
+          </w:tcPr>
+          <w:p>
+            <w:pPr>
+              <w:rPr>
+                <w:rFonts w:ascii="Arial" w:hAnsi="Arial" w:cs="Arial"/>
+              </w:rPr>
+            </w:pPr>
+            <w:r>
+              <w:rPr>
+                <w:rFonts w:ascii="Arial" w:hAnsi="Arial" w:cs="Arial"/>
+              </w:rPr>
+              <w:t>Detectar contenido inapropiado sin afectar la experiencia del usuario.</w:t>
+            </w:r>
+          </w:p>
+        </w:tc>
+        <w:tc>
+          <w:tcPr>
+            <w:tcW w:w="0" w:type="auto"/>
+            <w:vAlign w:val="center"/>
+            <w:hideMark/>
+          </w:tcPr>
+          <w:p>
+            <w:pPr>
+              <w:rPr>
+                <w:rFonts w:ascii="Arial" w:hAnsi="Arial" w:cs="Arial"/>
+              </w:rPr>
+            </w:pPr>
+            <w:r>
+              <w:rPr>
+                <w:rFonts w:ascii="Arial" w:hAnsi="Arial" w:cs="Arial"/>
+              </w:rPr>
+              <w:t>Implementar un módulo de validación previa basado en un diccionario configurable de términos prohibidos.</w:t>
+            </w:r>
+          </w:p>
+        </w:tc>
+      </w:tr>
+      <w:tr>
+        <w:trPr>
+          <w:tblCellSpacing w:w="15" w:type="dxa"/>
+        </w:trPr>
+        <w:tc>
+          <w:tcPr>
+            <w:tcW w:w="0" w:type="auto"/>
+            <w:vAlign w:val="center"/>
+            <w:hideMark/>
+          </w:tcPr>
+          <w:p>
+            <w:pPr>
+              <w:rPr>
+                <w:rFonts w:ascii="Arial" w:hAnsi="Arial" w:cs="Arial"/>
+              </w:rPr>
+            </w:pPr>
+            <w:r>
+              <w:rPr>
+                <w:rFonts w:ascii="Arial" w:hAnsi="Arial" w:cs="Arial"/>
+                <w:b/>
+                <w:bCs/>
+              </w:rPr>
+              <w:t>RF-14</w:t>
+            </w:r>
+          </w:p>
+        </w:tc>
+        <w:tc>
+          <w:tcPr>
+            <w:tcW w:w="0" w:type="auto"/>
+            <w:vAlign w:val="center"/>
+            <w:hideMark/>
+          </w:tcPr>
+          <w:p>
+            <w:pPr>
+              <w:rPr>
+                <w:rFonts w:ascii="Arial" w:hAnsi="Arial" w:cs="Arial"/>
+              </w:rPr>
+            </w:pPr>
+            <w:r>
+              <w:rPr>
+                <w:rFonts w:ascii="Arial" w:hAnsi="Arial" w:cs="Arial"/>
+                <w:b/>
+                <w:bCs/>
+              </w:rPr>
+              <w:t>Llamadas y Videollamadas entre Amigos</w:t>
+            </w:r>
+          </w:p>
+        </w:tc>
+        <w:tc>
+          <w:tcPr>
+            <w:tcW w:w="0" w:type="auto"/>
+            <w:vAlign w:val="center"/>
+            <w:hideMark/>
+          </w:tcPr>
+          <w:p>
+            <w:pPr>
+              <w:rPr>
+                <w:rFonts w:ascii="Arial" w:hAnsi="Arial" w:cs="Arial"/>
+              </w:rPr>
+            </w:pPr>
+            <w:r>
+              <w:rPr>
+                <w:rFonts w:ascii="Arial" w:hAnsi="Arial" w:cs="Arial"/>
+              </w:rPr>
+              <w:t>Permitir realizar llamadas de voz y videollamadas privadas entre usuarios con amistad confirmada.</w:t>
+            </w:r>
+          </w:p>
+        </w:tc>
+        <w:tc>
+          <w:tcPr>
+            <w:tcW w:w="0" w:type="auto"/>
+            <w:vAlign w:val="center"/>
+            <w:hideMark/>
+          </w:tcPr>
+          <w:p>
+            <w:pPr>
+              <w:rPr>
+                <w:rFonts w:ascii="Arial" w:hAnsi="Arial" w:cs="Arial"/>
+              </w:rPr>
+            </w:pPr>
+            <w:r>
+              <w:rPr>
+                <w:rFonts w:ascii="Arial" w:hAnsi="Arial" w:cs="Arial"/>
+              </w:rPr>
+              <w:t>Media</w:t>
+            </w:r>
+          </w:p>
+        </w:tc>
+        <w:tc>
+          <w:tcPr>
+            <w:tcW w:w="0" w:type="auto"/>
+            <w:vAlign w:val="center"/>
+            <w:hideMark/>
+          </w:tcPr>
+          <w:p>
+            <w:pPr>
+              <w:rPr>
+                <w:rFonts w:ascii="Arial" w:hAnsi="Arial" w:cs="Arial"/>
+              </w:rPr>
+            </w:pPr>
+            <w:r>
+              <w:rPr>
+                <w:rFonts w:ascii="Arial" w:hAnsi="Arial" w:cs="Arial"/>
+              </w:rPr>
+              <w:t>Garantizar privacidad y estabilidad durante la comunicación en tiempo real.</w:t>
+            </w:r>
+          </w:p>
+        </w:tc>
+        <w:tc>
+          <w:tcPr>
+            <w:tcW w:w="0" w:type="auto"/>
+            <w:vAlign w:val="center"/>
+            <w:hideMark/>
+          </w:tcPr>
+          <w:p>
+            <w:pPr>
+              <w:rPr>
+                <w:rFonts w:ascii="Arial" w:hAnsi="Arial" w:cs="Arial"/>
+              </w:rPr>
+            </w:pPr>
+            <w:r>
+              <w:rPr>
+                <w:rFonts w:ascii="Arial" w:hAnsi="Arial" w:cs="Arial"/>
+              </w:rPr>
+              <w:t xml:space="preserve">Implementar comunicación mediante </w:t>
+            </w:r>
+            <w:proofErr w:type="spellStart"/>
+            <w:r>
+              <w:rPr>
+                <w:rFonts w:ascii="Arial" w:hAnsi="Arial" w:cs="Arial"/>
+              </w:rPr>
+              <w:t>WebRTC</w:t>
+            </w:r>
+            <w:proofErr w:type="spellEnd"/>
+            <w:r>
+              <w:rPr>
+                <w:rFonts w:ascii="Arial" w:hAnsi="Arial" w:cs="Arial"/>
+              </w:rPr>
+              <w:t xml:space="preserve"> con validación previa de la relación de amistad entre los usuarios.</w:t>
+            </w:r>
+          </w:p>
+        </w:tc>
+      </w:tr>
+      <w:tr>
+        <w:trPr>
+          <w:tblCellSpacing w:w="15" w:type="dxa"/>
+        </w:trPr>
+        <w:tc>
+          <w:tcPr>
+            <w:tcW w:w="0" w:type="auto"/>
+            <w:vAlign w:val="center"/>
+            <w:hideMark/>
+          </w:tcPr>
+          <w:p>
+            <w:pPr>
+              <w:rPr>
+                <w:rFonts w:ascii="Arial" w:hAnsi="Arial" w:cs="Arial"/>
+              </w:rPr>
+            </w:pPr>
+            <w:r>
+              <w:rPr>
+                <w:rFonts w:ascii="Arial" w:hAnsi="Arial" w:cs="Arial"/>
+                <w:b/>
+                <w:bCs/>
+              </w:rPr>
+              <w:t>RF-15</w:t>
+            </w:r>
+          </w:p>
+        </w:tc>
+        <w:tc>
+          <w:tcPr>
+            <w:tcW w:w="0" w:type="auto"/>
+            <w:vAlign w:val="center"/>
+            <w:hideMark/>
+          </w:tcPr>
+          <w:p>
+            <w:pPr>
+              <w:rPr>
+                <w:rFonts w:ascii="Arial" w:hAnsi="Arial" w:cs="Arial"/>
+              </w:rPr>
+            </w:pPr>
+            <w:proofErr w:type="spellStart"/>
+            <w:r>
+              <w:rPr>
+                <w:rFonts w:ascii="Arial" w:hAnsi="Arial" w:cs="Arial"/>
+                <w:b/>
+                <w:bCs/>
+              </w:rPr>
+              <w:t>Livestream</w:t>
+            </w:r>
+            <w:proofErr w:type="spellEnd"/>
+            <w:r>
+              <w:rPr>
+                <w:rFonts w:ascii="Arial" w:hAnsi="Arial" w:cs="Arial"/>
+                <w:b/>
+                <w:bCs/>
+              </w:rPr>
+              <w:t xml:space="preserve"> como Publicación en Vivo</w:t>
+            </w:r>
+          </w:p>
+        </w:tc>
+        <w:tc>
+          <w:tcPr>
+            <w:tcW w:w="0" w:type="auto"/>
+            <w:vAlign w:val="center"/>
+            <w:hideMark/>
+          </w:tcPr>
+          <w:p>
+            <w:pPr>
+              <w:rPr>
+                <w:rFonts w:ascii="Arial" w:hAnsi="Arial" w:cs="Arial"/>
+              </w:rPr>
+            </w:pPr>
+            <w:r>
+              <w:rPr>
+                <w:rFonts w:ascii="Arial" w:hAnsi="Arial" w:cs="Arial"/>
+              </w:rPr>
+              <w:t>Permitir iniciar transmisiones en vivo configurando su visibilidad para toda la comunidad, amigos o usuarios de la misma facultad.</w:t>
+            </w:r>
+          </w:p>
+        </w:tc>
+        <w:tc>
+          <w:tcPr>
+            <w:tcW w:w="0" w:type="auto"/>
+            <w:vAlign w:val="center"/>
+            <w:hideMark/>
+          </w:tcPr>
+          <w:p>
+            <w:pPr>
+              <w:rPr>
+                <w:rFonts w:ascii="Arial" w:hAnsi="Arial" w:cs="Arial"/>
+              </w:rPr>
+            </w:pPr>
+            <w:r>
+              <w:rPr>
+                <w:rFonts w:ascii="Arial" w:hAnsi="Arial" w:cs="Arial"/>
+              </w:rPr>
+              <w:t>Baja</w:t>
+            </w:r>
+          </w:p>
+        </w:tc>
+        <w:tc>
+          <w:tcPr>
+            <w:tcW w:w="0" w:type="auto"/>
+            <w:vAlign w:val="center"/>
+            <w:hideMark/>
+          </w:tcPr>
+          <w:p>
+            <w:pPr>
+              <w:rPr>
+                <w:rFonts w:ascii="Arial" w:hAnsi="Arial" w:cs="Arial"/>
+              </w:rPr>
+            </w:pPr>
+            <w:r>
+              <w:rPr>
+                <w:rFonts w:ascii="Arial" w:hAnsi="Arial" w:cs="Arial"/>
+              </w:rPr>
+              <w:t>Gestionar el consumo de recursos del servidor y controlar quién puede acceder a la transmisión.</w:t>
+            </w:r>
+          </w:p>
+        </w:tc>
+        <w:tc>
+          <w:tcPr>
+            <w:tcW w:w="0" w:type="auto"/>
+            <w:vAlign w:val="center"/>
+            <w:hideMark/>
+          </w:tcPr>
+          <w:p>
+            <w:pPr>
+              <w:rPr>
+                <w:rFonts w:ascii="Arial" w:hAnsi="Arial" w:cs="Arial"/>
+              </w:rPr>
+            </w:pPr>
+            <w:r>
+              <w:rPr>
+                <w:rFonts w:ascii="Arial" w:hAnsi="Arial" w:cs="Arial"/>
+              </w:rPr>
+              <w:t xml:space="preserve">Implementar un módulo de </w:t>
+            </w:r>
+            <w:proofErr w:type="spellStart"/>
+            <w:r>
+              <w:rPr>
+                <w:rFonts w:ascii="Arial" w:hAnsi="Arial" w:cs="Arial"/>
+              </w:rPr>
+              <w:t>streaming</w:t>
+            </w:r>
+            <w:proofErr w:type="spellEnd"/>
+            <w:r>
+              <w:rPr>
+                <w:rFonts w:ascii="Arial" w:hAnsi="Arial" w:cs="Arial"/>
+              </w:rPr>
+              <w:t xml:space="preserve"> integrado al sistema de publicaciones, respetando las reglas de visibilidad configuradas por el usuario.</w:t>
+            </w:r>
+          </w:p>
+        </w:tc>
+      </w:tr>
+    </w:tbl>
+    <w:p>
+      <w:pPr>
+        <w:rPr>
+          <w:sz w:val="24"/>
+          <w:szCs w:val="24"/>
+        </w:rPr>
+      </w:pPr>
+    </w:p>
+    <w:p>
+      <w:pPr>
+        <w:rPr>
+          <w:sz w:val="24"/>
+          <w:szCs w:val="24"/>
+        </w:rPr>
+      </w:pPr>
+      <w:r>
+        <w:rPr>
+          <w:sz w:val="24"/>
+          <w:szCs w:val="24"/>
+        </w:rPr>
+        <w:lastRenderedPageBreak/>
         <w:t>También incorpora criterios de aceptación, prioridades y consideraciones técnicas que sirven como base para el desarrollo, validación y pruebas del sistema.</w:t>
       </w:r>
     </w:p>
@@ -6876,14 +9121,127 @@
       <w:pStyle w:val="Encabezado"/>
     </w:pPr>
     <w:r>
-      <w:t>Logo de Mi Empresa</w:t>
+      <w:rPr>
+        <w:noProof/>
+      </w:rPr>
+      <w:drawing>
+        <wp:inline distT="0" distB="0" distL="0" distR="0" wp14:anchorId="472AFA5E" wp14:editId="56D3D4CB">
+          <wp:extent cx="873457" cy="689709"/>
+          <wp:effectExtent l="0" t="0" r="3175" b="0"/>
+          <wp:docPr id="900371432" name="Imagen 2" descr="Imagen generada por IA"/>
+          <wp:cNvGraphicFramePr>
+            <a:graphicFrameLocks xmlns:a="http://schemas.openxmlformats.org/drawingml/2006/main" noChangeAspect="1"/>
+          </wp:cNvGraphicFramePr>
+          <a:graphic xmlns:a="http://schemas.openxmlformats.org/drawingml/2006/main">
+            <a:graphicData uri="http://schemas.openxmlformats.org/drawingml/2006/picture">
+              <pic:pic xmlns:pic="http://schemas.openxmlformats.org/drawingml/2006/picture">
+                <pic:nvPicPr>
+                  <pic:cNvPr id="0" name="Picture 3" descr="Imagen generada por IA"/>
+                  <pic:cNvPicPr>
+                    <a:picLocks noChangeAspect="1" noChangeArrowheads="1"/>
+                  </pic:cNvPicPr>
+                </pic:nvPicPr>
+                <pic:blipFill rotWithShape="1">
+                  <a:blip r:embed="rId1">
+                    <a:extLst>
+                      <a:ext uri="{28A0092B-C50C-407E-A947-70E740481C1C}">
+                        <a14:useLocalDpi xmlns:a14="http://schemas.microsoft.com/office/drawing/2010/main" val="0"/>
+                      </a:ext>
+                    </a:extLst>
+                  </a:blip>
+                  <a:srcRect l="29190" t="13889" r="29722" b="26610"/>
+                  <a:stretch>
+                    <a:fillRect/>
+                  </a:stretch>
+                </pic:blipFill>
+                <pic:spPr bwMode="auto">
+                  <a:xfrm>
+                    <a:off x="0" y="0"/>
+                    <a:ext cx="889603" cy="702458"/>
+                  </a:xfrm>
+                  <a:prstGeom prst="rect">
+                    <a:avLst/>
+                  </a:prstGeom>
+                  <a:noFill/>
+                  <a:ln>
+                    <a:noFill/>
+                  </a:ln>
+                  <a:extLst>
+                    <a:ext uri="{53640926-AAD7-44D8-BBD7-CCE9431645EC}">
+                      <a14:shadowObscured xmlns:a14="http://schemas.microsoft.com/office/drawing/2010/main"/>
+                    </a:ext>
+                  </a:extLst>
+                </pic:spPr>
+              </pic:pic>
+            </a:graphicData>
+          </a:graphic>
+        </wp:inline>
+      </w:drawing>
     </w:r>
     <w:r>
       <w:tab/>
     </w:r>
     <w:r>
       <w:tab/>
-      <w:t>Logo de mi Cliente</w:t>
+    </w:r>
+    <w:r>
+      <w:rPr>
+        <w:rFonts w:ascii="Arial" w:hAnsi="Arial" w:cs="Arial"/>
+        <w:b/>
+        <w:noProof/>
+        <w:color w:val="000000"/>
+        <w:sz w:val="36"/>
+        <w:szCs w:val="36"/>
+        <w:lang w:eastAsia="es-PE"/>
+      </w:rPr>
+      <w:drawing>
+        <wp:inline distT="0" distB="0" distL="0" distR="0" wp14:anchorId="4D85C611" wp14:editId="200C52AB">
+          <wp:extent cx="475795" cy="639593"/>
+          <wp:effectExtent l="0" t="0" r="635" b="8255"/>
+          <wp:docPr id="941441010" name="Imagen 941441010" descr="C:\Users\EPIS\Documents\upt.png"/>
+          <wp:cNvGraphicFramePr>
+            <a:graphicFrameLocks xmlns:a="http://schemas.openxmlformats.org/drawingml/2006/main" noChangeAspect="1"/>
+          </wp:cNvGraphicFramePr>
+          <a:graphic xmlns:a="http://schemas.openxmlformats.org/drawingml/2006/main">
+            <a:graphicData uri="http://schemas.openxmlformats.org/drawingml/2006/picture">
+              <pic:pic xmlns:pic="http://schemas.openxmlformats.org/drawingml/2006/picture">
+                <pic:nvPicPr>
+                  <pic:cNvPr id="0" name="Picture 1" descr="C:\Users\EPIS\Documents\upt.png"/>
+                  <pic:cNvPicPr>
+                    <a:picLocks noChangeAspect="1" noChangeArrowheads="1"/>
+                  </pic:cNvPicPr>
+                </pic:nvPicPr>
+                <pic:blipFill>
+                  <a:blip r:embed="rId2" cstate="print">
+                    <a:extLst>
+                      <a:ext uri="{28A0092B-C50C-407E-A947-70E740481C1C}">
+                        <a14:useLocalDpi xmlns:a14="http://schemas.microsoft.com/office/drawing/2010/main" val="0"/>
+                      </a:ext>
+                    </a:extLst>
+                  </a:blip>
+                  <a:srcRect/>
+                  <a:stretch>
+                    <a:fillRect/>
+                  </a:stretch>
+                </pic:blipFill>
+                <pic:spPr bwMode="auto">
+                  <a:xfrm>
+                    <a:off x="0" y="0"/>
+                    <a:ext cx="485580" cy="652746"/>
+                  </a:xfrm>
+                  <a:prstGeom prst="rect">
+                    <a:avLst/>
+                  </a:prstGeom>
+                  <a:noFill/>
+                  <a:ln>
+                    <a:noFill/>
+                  </a:ln>
+                </pic:spPr>
+              </pic:pic>
+            </a:graphicData>
+          </a:graphic>
+        </wp:inline>
+      </w:drawing>
     </w:r>
   </w:p>
 </w:hdr>
@@ -9845,6 +12203,7 @@
   <w:style w:type="character" w:default="1" w:styleId="Fuentedeprrafopredeter">
     <w:name w:val="Default Paragraph Font"/>
     <w:uiPriority w:val="1"/>
+    <w:semiHidden/>
     <w:unhideWhenUsed/>
   </w:style>
   <w:style w:type="table" w:default="1" w:styleId="Tablanormal">

</xml_diff>